<commit_message>
Add HomeLab note to technical skills in master and Western Pacific CVs
</commit_message>
<xml_diff>
--- a/jobs/western-pacific/cv.docx
+++ b/jobs/western-pacific/cv.docx
@@ -257,6 +257,25 @@
       </w:r>
       <w:r>
         <w:t xml:space="preserve"> Intune, MobileIron MDM, iOS/macOS setup tools, Ivanti / Acronis imaging, Active Directory / Okta.</w:t>
+      </w:r>
+    </w:p>
+    <w:p>
+      <w:pPr>
+        <w:pStyle w:val="Bullet"/>
+        <w:numPr>
+          <w:ilvl w:val="0"/>
+          <w:numId w:val="1"/>
+        </w:numPr>
+      </w:pPr>
+      <w:r>
+        <w:rPr>
+          <w:b/>
+          <w:bCs/>
+        </w:rPr>
+        <w:t xml:space="preserve">Continuous Learning &amp; Research:</w:t>
+      </w:r>
+      <w:r>
+        <w:t xml:space="preserve"> Maintain an enterprise-grade HomeLab (vSphere/ESXi, Active Directory, and virtualized servers) to stay on top of emerging technologies and test workflow automation solutions.</w:t>
       </w:r>
     </w:p>
     <w:p>

</xml_diff>

<commit_message>
Update network troubleshooting to advanced and add AWS coursework to Clark College in master and Western Pacific CVs
</commit_message>
<xml_diff>
--- a/jobs/western-pacific/cv.docx
+++ b/jobs/western-pacific/cv.docx
@@ -31,7 +31,7 @@
         <w:pStyle w:val="Body"/>
       </w:pPr>
       <w:r>
-        <w:t xml:space="preserve">Customer-focused Desktop Support Analyst with 10 years of hands-on IT experience across corporate office and manufacturing/industrial environments. Proven track record managing user accounts and access controls in Active Directory/Okta, deploying system builds with network imaging tools, and resolving walkup and remote helpdesk tickets. Adept at hardware diagnostics, peripheral configurations (printers/scanners), and basic network troubleshooting (Meraki SD-WAN) in fast-paced supplier settings, ensuring compliance with IT security and safety protocols.</w:t>
+        <w:t xml:space="preserve">Customer-focused Desktop Support Analyst with 10 years of hands-on IT experience across corporate office and manufacturing/industrial environments. Proven track record managing user accounts and access controls in Active Directory/Okta, deploying system builds with network imaging tools, and resolving walkup and remote helpdesk tickets. Adept at hardware diagnostics, peripheral configurations (printers/scanners), and advanced network troubleshooting (Meraki SD-WAN) in fast-paced supplier settings, ensuring compliance with IT security and safety protocols.</w:t>
       </w:r>
     </w:p>
     <w:p>
@@ -544,6 +544,18 @@
       </w:pPr>
       <w:r>
         <w:t xml:space="preserve">Supported lab infrastructure migrations and mentored students in network subnetting.</w:t>
+      </w:r>
+    </w:p>
+    <w:p>
+      <w:pPr>
+        <w:pStyle w:val="Bullet"/>
+        <w:numPr>
+          <w:ilvl w:val="0"/>
+          <w:numId w:val="1"/>
+        </w:numPr>
+      </w:pPr>
+      <w:r>
+        <w:t xml:space="preserve">Gained hands-on experience configuring and administering AWS Web Services for WebDev course environments.</w:t>
       </w:r>
     </w:p>
     <w:p>

</xml_diff>

<commit_message>
Grammar and voice pass on Western Pacific CV and cover letter
</commit_message>
<xml_diff>
--- a/jobs/western-pacific/cv.docx
+++ b/jobs/western-pacific/cv.docx
@@ -335,7 +335,7 @@
         </w:numPr>
       </w:pPr>
       <w:r>
-        <w:t xml:space="preserve">Setup and configure client devices using enterprise macOS/iOS setup tools, configuration profiles, and MDM platforms (Intune, MobileIron, Ivanti).</w:t>
+        <w:t xml:space="preserve">Set up and configure client devices using enterprise macOS/iOS setup tools, configuration profiles, and MDM platforms (Intune, MobileIron, Ivanti).</w:t>
       </w:r>
     </w:p>
     <w:p>
@@ -483,7 +483,7 @@
         <w:pStyle w:val="Company"/>
       </w:pPr>
       <w:r>
-        <w:t xml:space="preserve">Network / Microsoft Technology Lab Volunteer Technician | Clark College</w:t>
+        <w:t xml:space="preserve">Network &amp; Microsoft Technology Lab Volunteer Technician | Clark College</w:t>
       </w:r>
     </w:p>
     <w:p>
@@ -555,7 +555,7 @@
         </w:numPr>
       </w:pPr>
       <w:r>
-        <w:t xml:space="preserve">Gained hands-on experience configuring and administering AWS Web Services for WebDev course environments.</w:t>
+        <w:t xml:space="preserve">Gained hands-on experience configuring and deploying AWS cloud services (EC2) through a WebDev course curriculum.</w:t>
       </w:r>
     </w:p>
     <w:p>

</xml_diff>

<commit_message>
Add Ubiquiti UniFi to summary and networking skills across master and Western Pacific CVs
</commit_message>
<xml_diff>
--- a/jobs/western-pacific/cv.docx
+++ b/jobs/western-pacific/cv.docx
@@ -31,7 +31,7 @@
         <w:pStyle w:val="Body"/>
       </w:pPr>
       <w:r>
-        <w:t xml:space="preserve">Customer-focused Desktop Support Analyst with 10 years of hands-on IT experience across corporate office and manufacturing/industrial environments. Proven track record managing user accounts and access controls in Active Directory/Okta, deploying system builds with network imaging tools, and resolving walkup and remote helpdesk tickets. Adept at hardware diagnostics, peripheral configurations (printers/scanners), and advanced network troubleshooting (Meraki SD-WAN) in fast-paced supplier settings, ensuring compliance with IT security and safety protocols.</w:t>
+        <w:t xml:space="preserve">Customer-focused Desktop Support Analyst with 10 years of hands-on IT experience across corporate office and manufacturing/industrial environments. Proven track record managing user accounts and access controls in Active Directory/Okta, deploying system builds with network imaging tools, and resolving walkup and remote helpdesk tickets. Adept at hardware diagnostics, peripheral configurations (printers/scanners), and advanced network troubleshooting across Meraki SD-WAN and Ubiquiti UniFi environments, ensuring compliance with IT security and safety protocols.</w:t>
       </w:r>
     </w:p>
     <w:p>
@@ -237,7 +237,7 @@
         <w:t xml:space="preserve">Networking:</w:t>
       </w:r>
       <w:r>
-        <w:t xml:space="preserve"> Cisco/Meraki routing &amp; switching, DNS/DHCP, VPN/IPSec, Wireshark diagnostics.</w:t>
+        <w:t xml:space="preserve"> Cisco/Meraki SD-WAN, Ubiquiti UniFi, DNS/DHCP, VPN/IPSec, Wireshark diagnostics.</w:t>
       </w:r>
     </w:p>
     <w:p>

</xml_diff>

<commit_message>
ATS optimization pass: add warehouse devices, print server, PowerShell, Windows Server depth, VLANs, PPE, SOPs to Western Pacific CV
</commit_message>
<xml_diff>
--- a/jobs/western-pacific/cv.docx
+++ b/jobs/western-pacific/cv.docx
@@ -31,7 +31,7 @@
         <w:pStyle w:val="Body"/>
       </w:pPr>
       <w:r>
-        <w:t xml:space="preserve">Customer-focused Desktop Support Analyst with 10 years of hands-on IT experience across corporate office and manufacturing/industrial environments. Proven track record managing user accounts and access controls in Active Directory/Okta, deploying system builds with network imaging tools, and resolving walkup and remote helpdesk tickets. Adept at hardware diagnostics, peripheral configurations (printers/scanners), and advanced network troubleshooting across Meraki SD-WAN and Ubiquiti UniFi environments, ensuring compliance with IT security and safety protocols.</w:t>
+        <w:t xml:space="preserve">Customer-focused Desktop Support Analyst with 10 years of hands-on IT experience across corporate office and manufacturing/industrial environments. Proven track record managing user accounts and access controls in Active Directory/Okta, deploying system builds with network imaging tools, and resolving walkup, phone, and helpdesk tickets end-to-end. Adept at hardware diagnostics, peripheral and printer fleet management, warehouse device support, and advanced network troubleshooting across Meraki SD-WAN and Ubiquiti UniFi environments, ensuring compliance with IT security and safety protocols.</w:t>
       </w:r>
     </w:p>
     <w:p>
@@ -199,7 +199,7 @@
         <w:t xml:space="preserve">Troubleshooting &amp; Support:</w:t>
       </w:r>
       <w:r>
-        <w:t xml:space="preserve"> Walkup &amp; deskside support, hardware diagnostics, break/fix, printer configurations (HP/Lexmark), rugged factory devices, A/V conferencing, ServiceNow.</w:t>
+        <w:t xml:space="preserve"> Inbound help desk calls, walkup &amp; deskside support, hardware diagnostics, break/fix, printer fleet management (HP/Lexmark, print servers, driver deployment), rugged factory devices, A/V conferencing, ServiceNow.</w:t>
       </w:r>
     </w:p>
     <w:p>
@@ -218,7 +218,7 @@
         <w:t xml:space="preserve">Operating Systems:</w:t>
       </w:r>
       <w:r>
-        <w:t xml:space="preserve"> Windows 10/11, Windows Server, macOS, Linux.</w:t>
+        <w:t xml:space="preserve"> Windows 10/11, Windows Server (AD, DNS, DHCP, GPOs), macOS, Linux.</w:t>
       </w:r>
     </w:p>
     <w:p>
@@ -237,7 +237,7 @@
         <w:t xml:space="preserve">Networking:</w:t>
       </w:r>
       <w:r>
-        <w:t xml:space="preserve"> Cisco/Meraki SD-WAN, Ubiquiti UniFi, DNS/DHCP, VPN/IPSec, Wireshark diagnostics.</w:t>
+        <w:t xml:space="preserve"> Cisco/Meraki SD-WAN, Ubiquiti UniFi, VLAN configuration, physical cabling &amp; patch panel termination, DNS/DHCP, VPN/IPSec, Wireshark diagnostics.</w:t>
       </w:r>
     </w:p>
     <w:p>
@@ -256,7 +256,26 @@
         <w:t xml:space="preserve">Endpoint &amp; Fleet Management:</w:t>
       </w:r>
       <w:r>
-        <w:t xml:space="preserve"> Intune, MobileIron MDM, iOS/macOS setup tools, Ivanti / Acronis imaging, Active Directory / Okta.</w:t>
+        <w:t xml:space="preserve"> Intune, MobileIron MDM, iOS/macOS setup tools, Ivanti / Acronis imaging, Active Directory / Okta, PowerShell automation.</w:t>
+      </w:r>
+    </w:p>
+    <w:p>
+      <w:pPr>
+        <w:pStyle w:val="Bullet"/>
+        <w:numPr>
+          <w:ilvl w:val="0"/>
+          <w:numId w:val="1"/>
+        </w:numPr>
+      </w:pPr>
+      <w:r>
+        <w:rPr>
+          <w:b/>
+          <w:bCs/>
+        </w:rPr>
+        <w:t xml:space="preserve">Warehouse &amp; Industrial Devices:</w:t>
+      </w:r>
+      <w:r>
+        <w:t xml:space="preserve"> Barcode scanners, label printers, handheld RF units, rugged mobile terminals.</w:t>
       </w:r>
     </w:p>
     <w:p>
@@ -311,7 +330,7 @@
         </w:numPr>
       </w:pPr>
       <w:r>
-        <w:t xml:space="preserve">Provide customer-first walkup, deskside, and remote helpdesk support, resolving mobile device, OS, and software issues for corporate end-users.</w:t>
+        <w:t xml:space="preserve">Handle inbound help desk calls, walkup, and remote support requests, resolving mobile device, OS, and software issues for corporate end-users with customer-first service.</w:t>
       </w:r>
     </w:p>
     <w:p>
@@ -371,7 +390,7 @@
         </w:numPr>
       </w:pPr>
       <w:r>
-        <w:t xml:space="preserve">Develop and enhance user-facing setup guides in Confluence to streamline self-service deployments and remote enrollment.</w:t>
+        <w:t xml:space="preserve">Develop and maintain IT SOPs and user-facing setup guides in Confluence, adopted as standard procedures for self-service deployments and remote enrollment.</w:t>
       </w:r>
     </w:p>
     <w:p>
@@ -403,67 +422,55 @@
         </w:numPr>
       </w:pPr>
       <w:r>
-        <w:t xml:space="preserve">Supported end-users through walk-ins, phone support, and ServiceNow ticket management.</w:t>
-      </w:r>
-    </w:p>
-    <w:p>
-      <w:pPr>
-        <w:pStyle w:val="Bullet"/>
-        <w:numPr>
-          <w:ilvl w:val="0"/>
-          <w:numId w:val="1"/>
-        </w:numPr>
-      </w:pPr>
-      <w:r>
-        <w:t xml:space="preserve">Managed the lifecycle of desktop and mobile assets, from initial hardware ordering and provisioning to secure device retirement and decommissioning.</w:t>
-      </w:r>
-    </w:p>
-    <w:p>
-      <w:pPr>
-        <w:pStyle w:val="Bullet"/>
-        <w:numPr>
-          <w:ilvl w:val="0"/>
-          <w:numId w:val="1"/>
-        </w:numPr>
-      </w:pPr>
-      <w:r>
-        <w:t xml:space="preserve">Deployed and configured laptops and desktops utilizing Ivanti and Acronis system imaging.</w:t>
-      </w:r>
-    </w:p>
-    <w:p>
-      <w:pPr>
-        <w:pStyle w:val="Bullet"/>
-        <w:numPr>
-          <w:ilvl w:val="0"/>
-          <w:numId w:val="1"/>
-        </w:numPr>
-      </w:pPr>
-      <w:r>
-        <w:t xml:space="preserve">Installed and administered Meraki SD-WAN networking devices to restore network connectivity across offices and industrial fabrication shops.</w:t>
-      </w:r>
-    </w:p>
-    <w:p>
-      <w:pPr>
-        <w:pStyle w:val="Bullet"/>
-        <w:numPr>
-          <w:ilvl w:val="0"/>
-          <w:numId w:val="1"/>
-        </w:numPr>
-      </w:pPr>
-      <w:r>
-        <w:t xml:space="preserve">Administered Active Directory (AD) and Okta for user provisioning, group policies, access control, and user lifecycle management.</w:t>
-      </w:r>
-    </w:p>
-    <w:p>
-      <w:pPr>
-        <w:pStyle w:val="Bullet"/>
-        <w:numPr>
-          <w:ilvl w:val="0"/>
-          <w:numId w:val="1"/>
-        </w:numPr>
-      </w:pPr>
-      <w:r>
-        <w:t xml:space="preserve">Configured and managed Zoom and Microsoft Teams conferencing rooms and management portals.</w:t>
+        <w:t xml:space="preserve">Triaged and resolved inbound help desk calls, walk-in requests, and ServiceNow ticket queue end-to-end, independently managing priority and SLA compliance across multiple sites.</w:t>
+      </w:r>
+    </w:p>
+    <w:p>
+      <w:pPr>
+        <w:pStyle w:val="Bullet"/>
+        <w:numPr>
+          <w:ilvl w:val="0"/>
+          <w:numId w:val="1"/>
+        </w:numPr>
+      </w:pPr>
+      <w:r>
+        <w:t xml:space="preserve">Deployed and configured laptops, desktops, and warehouse devices (barcode scanners, label printers, handheld RF units) using Ivanti and Acronis system imaging.</w:t>
+      </w:r>
+    </w:p>
+    <w:p>
+      <w:pPr>
+        <w:pStyle w:val="Bullet"/>
+        <w:numPr>
+          <w:ilvl w:val="0"/>
+          <w:numId w:val="1"/>
+        </w:numPr>
+      </w:pPr>
+      <w:r>
+        <w:t xml:space="preserve">Administered Windows Server environments including Active Directory, DNS, DHCP, and Group Policy Objects (GPOs); automated bulk user provisioning and reporting with PowerShell scripts.</w:t>
+      </w:r>
+    </w:p>
+    <w:p>
+      <w:pPr>
+        <w:pStyle w:val="Bullet"/>
+        <w:numPr>
+          <w:ilvl w:val="0"/>
+          <w:numId w:val="1"/>
+        </w:numPr>
+      </w:pPr>
+      <w:r>
+        <w:t xml:space="preserve">Managed network printer fleet (HP/Lexmark), including print server setup and driver deployment standardized across branch offices.</w:t>
+      </w:r>
+    </w:p>
+    <w:p>
+      <w:pPr>
+        <w:pStyle w:val="Bullet"/>
+        <w:numPr>
+          <w:ilvl w:val="0"/>
+          <w:numId w:val="1"/>
+        </w:numPr>
+      </w:pPr>
+      <w:r>
+        <w:t xml:space="preserve">Installed and administered Meraki SD-WAN appliances; configured VLANs, racked and patched switching hardware, and terminated network drops across offices and industrial fabrication shops.</w:t>
       </w:r>
     </w:p>
     <w:p>
@@ -476,6 +483,30 @@
       </w:pPr>
       <w:r>
         <w:t xml:space="preserve">Served as Junior Administrator for Cisco and Meraki network infrastructure, managing SD-WAN deployments, VoIP systems, and switching configurations across multiple branch sites.</w:t>
+      </w:r>
+    </w:p>
+    <w:p>
+      <w:pPr>
+        <w:pStyle w:val="Bullet"/>
+        <w:numPr>
+          <w:ilvl w:val="0"/>
+          <w:numId w:val="1"/>
+        </w:numPr>
+      </w:pPr>
+      <w:r>
+        <w:t xml:space="preserve">Authored IT SOPs and runbooks for imaging, onboarding, and hardware deployment, adopted as standard procedures across branch teams.</w:t>
+      </w:r>
+    </w:p>
+    <w:p>
+      <w:pPr>
+        <w:pStyle w:val="Bullet"/>
+        <w:numPr>
+          <w:ilvl w:val="0"/>
+          <w:numId w:val="1"/>
+        </w:numPr>
+      </w:pPr>
+      <w:r>
+        <w:t xml:space="preserve">Supported industrial jobsite visits wearing required PPE and adhering to site safety protocols to maintain field office IT hardware.</w:t>
       </w:r>
     </w:p>
     <w:p>

</xml_diff>

<commit_message>
Trim to 2 pages, fix Confluence (JH Kelly) and ServiceNow (Daimler) placements
</commit_message>
<xml_diff>
--- a/jobs/western-pacific/cv.docx
+++ b/jobs/western-pacific/cv.docx
@@ -131,25 +131,6 @@
           <w:b/>
           <w:bCs/>
         </w:rPr>
-        <w:t xml:space="preserve">MTA Microsoft Security Essentials</w:t>
-      </w:r>
-      <w:r>
-        <w:t xml:space="preserve"> (2015)</w:t>
-      </w:r>
-    </w:p>
-    <w:p>
-      <w:pPr>
-        <w:pStyle w:val="Bullet"/>
-        <w:numPr>
-          <w:ilvl w:val="0"/>
-          <w:numId w:val="1"/>
-        </w:numPr>
-      </w:pPr>
-      <w:r>
-        <w:rPr>
-          <w:b/>
-          <w:bCs/>
-        </w:rPr>
         <w:t xml:space="preserve">MTA Database Fundamentals</w:t>
       </w:r>
       <w:r>
@@ -199,7 +180,7 @@
         <w:t xml:space="preserve">Troubleshooting &amp; Support:</w:t>
       </w:r>
       <w:r>
-        <w:t xml:space="preserve"> Inbound help desk calls, walkup &amp; deskside support, hardware diagnostics, break/fix, printer fleet management (HP/Lexmark, print servers, driver deployment), rugged factory devices, A/V conferencing, ServiceNow.</w:t>
+        <w:t xml:space="preserve"> Inbound help desk calls, walkup &amp; deskside support, hardware diagnostics, break/fix, printer fleet management (HP/Lexmark, print servers, driver deployment), warehouse devices, A/V conferencing, ServiceNow.</w:t>
       </w:r>
     </w:p>
     <w:p>
@@ -237,7 +218,7 @@
         <w:t xml:space="preserve">Networking:</w:t>
       </w:r>
       <w:r>
-        <w:t xml:space="preserve"> Cisco/Meraki SD-WAN, Ubiquiti UniFi, VLAN configuration, physical cabling &amp; patch panel termination, DNS/DHCP, VPN/IPSec, Wireshark diagnostics.</w:t>
+        <w:t xml:space="preserve"> Cisco/Meraki SD-WAN, Ubiquiti UniFi, VLAN configuration, physical cabling &amp; patching, DNS/DHCP, VPN/IPSec, Wireshark.</w:t>
       </w:r>
     </w:p>
     <w:p>
@@ -272,29 +253,10 @@
           <w:b/>
           <w:bCs/>
         </w:rPr>
-        <w:t xml:space="preserve">Warehouse &amp; Industrial Devices:</w:t>
-      </w:r>
-      <w:r>
-        <w:t xml:space="preserve"> Barcode scanners, label printers, handheld RF units, rugged mobile terminals.</w:t>
-      </w:r>
-    </w:p>
-    <w:p>
-      <w:pPr>
-        <w:pStyle w:val="Bullet"/>
-        <w:numPr>
-          <w:ilvl w:val="0"/>
-          <w:numId w:val="1"/>
-        </w:numPr>
-      </w:pPr>
-      <w:r>
-        <w:rPr>
-          <w:b/>
-          <w:bCs/>
-        </w:rPr>
         <w:t xml:space="preserve">Continuous Learning &amp; Research:</w:t>
       </w:r>
       <w:r>
-        <w:t xml:space="preserve"> Maintain an enterprise-grade HomeLab (vSphere/ESXi, Active Directory, and virtualized servers) to stay on top of emerging technologies and test workflow automation solutions.</w:t>
+        <w:t xml:space="preserve"> Maintain an enterprise-grade HomeLab (vSphere/ESXi, Active Directory, and virtualized servers) to stay current with emerging technologies and test workflow automation improvements.</w:t>
       </w:r>
     </w:p>
     <w:p>
@@ -330,7 +292,7 @@
         </w:numPr>
       </w:pPr>
       <w:r>
-        <w:t xml:space="preserve">Handle inbound help desk calls, walkup, and remote support requests, resolving mobile device, OS, and software issues for corporate end-users with customer-first service.</w:t>
+        <w:t xml:space="preserve">Handle inbound help desk calls, walkup, and remote support requests via ServiceNow, resolving mobile device, OS, and software issues for corporate end-users.</w:t>
       </w:r>
     </w:p>
     <w:p>
@@ -366,31 +328,19 @@
         </w:numPr>
       </w:pPr>
       <w:r>
-        <w:t xml:space="preserve">Execute hardware decommissioning and device retirement processes, ensuring secure data wiping, asset de-registration, and resource reclamation.</w:t>
-      </w:r>
-    </w:p>
-    <w:p>
-      <w:pPr>
-        <w:pStyle w:val="Bullet"/>
-        <w:numPr>
-          <w:ilvl w:val="0"/>
-          <w:numId w:val="1"/>
-        </w:numPr>
-      </w:pPr>
-      <w:r>
-        <w:t xml:space="preserve">Manage asset lifecycles, assign hardware, and resolve escalated ticketing queues within strict SLAs.</w:t>
-      </w:r>
-    </w:p>
-    <w:p>
-      <w:pPr>
-        <w:pStyle w:val="Bullet"/>
-        <w:numPr>
-          <w:ilvl w:val="0"/>
-          <w:numId w:val="1"/>
-        </w:numPr>
-      </w:pPr>
-      <w:r>
-        <w:t xml:space="preserve">Develop and maintain IT SOPs and user-facing setup guides in Confluence, adopted as standard procedures for self-service deployments and remote enrollment.</w:t>
+        <w:t xml:space="preserve">Manage asset lifecycles, execute hardware decommissioning (data wiping, asset de-registration), and resolve escalated ticket queues within strict SLAs.</w:t>
+      </w:r>
+    </w:p>
+    <w:p>
+      <w:pPr>
+        <w:pStyle w:val="Bullet"/>
+        <w:numPr>
+          <w:ilvl w:val="0"/>
+          <w:numId w:val="1"/>
+        </w:numPr>
+      </w:pPr>
+      <w:r>
+        <w:t xml:space="preserve">Develop and maintain IT SOPs and user-facing setup guides adopted as standard procedures for self-service deployments and remote enrollment.</w:t>
       </w:r>
     </w:p>
     <w:p>
@@ -422,7 +372,7 @@
         </w:numPr>
       </w:pPr>
       <w:r>
-        <w:t xml:space="preserve">Triaged and resolved inbound help desk calls, walk-in requests, and ServiceNow ticket queue end-to-end, independently managing priority and SLA compliance across multiple sites.</w:t>
+        <w:t xml:space="preserve">Triaged and resolved inbound help desk calls, walk-in requests, and ticket queue end-to-end, independently managing priority and SLA compliance across multiple sites.</w:t>
       </w:r>
     </w:p>
     <w:p>
@@ -458,43 +408,19 @@
         </w:numPr>
       </w:pPr>
       <w:r>
-        <w:t xml:space="preserve">Managed network printer fleet (HP/Lexmark), including print server setup and driver deployment standardized across branch offices.</w:t>
-      </w:r>
-    </w:p>
-    <w:p>
-      <w:pPr>
-        <w:pStyle w:val="Bullet"/>
-        <w:numPr>
-          <w:ilvl w:val="0"/>
-          <w:numId w:val="1"/>
-        </w:numPr>
-      </w:pPr>
-      <w:r>
-        <w:t xml:space="preserve">Installed and administered Meraki SD-WAN appliances; configured VLANs, racked and patched switching hardware, and terminated network drops across offices and industrial fabrication shops.</w:t>
-      </w:r>
-    </w:p>
-    <w:p>
-      <w:pPr>
-        <w:pStyle w:val="Bullet"/>
-        <w:numPr>
-          <w:ilvl w:val="0"/>
-          <w:numId w:val="1"/>
-        </w:numPr>
-      </w:pPr>
-      <w:r>
-        <w:t xml:space="preserve">Served as Junior Administrator for Cisco and Meraki network infrastructure, managing SD-WAN deployments, VoIP systems, and switching configurations across multiple branch sites.</w:t>
-      </w:r>
-    </w:p>
-    <w:p>
-      <w:pPr>
-        <w:pStyle w:val="Bullet"/>
-        <w:numPr>
-          <w:ilvl w:val="0"/>
-          <w:numId w:val="1"/>
-        </w:numPr>
-      </w:pPr>
-      <w:r>
-        <w:t xml:space="preserve">Authored IT SOPs and runbooks for imaging, onboarding, and hardware deployment, adopted as standard procedures across branch teams.</w:t>
+        <w:t xml:space="preserve">Managed network printer fleet (HP/Lexmark) including print server setup and driver deployment; authored IT SOPs and runbooks in Confluence adopted as branch-wide standard procedures.</w:t>
+      </w:r>
+    </w:p>
+    <w:p>
+      <w:pPr>
+        <w:pStyle w:val="Bullet"/>
+        <w:numPr>
+          <w:ilvl w:val="0"/>
+          <w:numId w:val="1"/>
+        </w:numPr>
+      </w:pPr>
+      <w:r>
+        <w:t xml:space="preserve">Installed and administered Meraki SD-WAN appliances; configured VLANs, racked/patched switching hardware, and terminated network drops; served as Junior Administrator for Cisco and Meraki infrastructure including VoIP systems.</w:t>
       </w:r>
     </w:p>
     <w:p>
@@ -550,43 +476,19 @@
         </w:numPr>
       </w:pPr>
       <w:r>
-        <w:t xml:space="preserve">Diagnosed, replaced, and maintained Cisco physical hardware (HWICs, SMART-Serial, interfaces).</w:t>
-      </w:r>
-    </w:p>
-    <w:p>
-      <w:pPr>
-        <w:pStyle w:val="Bullet"/>
-        <w:numPr>
-          <w:ilvl w:val="0"/>
-          <w:numId w:val="1"/>
-        </w:numPr>
-      </w:pPr>
-      <w:r>
-        <w:t xml:space="preserve">Performed rack and hardware maintenance including SAN hot-swapping and UPS battery replacement.</w:t>
-      </w:r>
-    </w:p>
-    <w:p>
-      <w:pPr>
-        <w:pStyle w:val="Bullet"/>
-        <w:numPr>
-          <w:ilvl w:val="0"/>
-          <w:numId w:val="1"/>
-        </w:numPr>
-      </w:pPr>
-      <w:r>
-        <w:t xml:space="preserve">Supported lab infrastructure migrations and mentored students in network subnetting.</w:t>
-      </w:r>
-    </w:p>
-    <w:p>
-      <w:pPr>
-        <w:pStyle w:val="Bullet"/>
-        <w:numPr>
-          <w:ilvl w:val="0"/>
-          <w:numId w:val="1"/>
-        </w:numPr>
-      </w:pPr>
-      <w:r>
-        <w:t xml:space="preserve">Gained hands-on experience launching and configuring AWS EC2 instances through a WebDev course curriculum.</w:t>
+        <w:t xml:space="preserve">Performed rack and hardware maintenance including Cisco hardware replacement (HWICs, SMART-Serial), SAN hot-swapping, and UPS battery replacement.</w:t>
+      </w:r>
+    </w:p>
+    <w:p>
+      <w:pPr>
+        <w:pStyle w:val="Bullet"/>
+        <w:numPr>
+          <w:ilvl w:val="0"/>
+          <w:numId w:val="1"/>
+        </w:numPr>
+      </w:pPr>
+      <w:r>
+        <w:t xml:space="preserve">Supported lab infrastructure migrations, mentored students in network subnetting, and gained hands-on AWS EC2 experience through a WebDev course curriculum.</w:t>
       </w:r>
     </w:p>
     <w:p>
@@ -614,31 +516,19 @@
         </w:numPr>
       </w:pPr>
       <w:r>
-        <w:t xml:space="preserve">Executed login scripts, managed client system rollouts, and configured Windows desktop environments.</w:t>
-      </w:r>
-    </w:p>
-    <w:p>
-      <w:pPr>
-        <w:pStyle w:val="Bullet"/>
-        <w:numPr>
-          <w:ilvl w:val="0"/>
-          <w:numId w:val="1"/>
-        </w:numPr>
-      </w:pPr>
-      <w:r>
-        <w:t xml:space="preserve">Investigated and diagnosed operating system and hardware performance issues.</w:t>
-      </w:r>
-    </w:p>
-    <w:p>
-      <w:pPr>
-        <w:pStyle w:val="Bullet"/>
-        <w:numPr>
-          <w:ilvl w:val="0"/>
-          <w:numId w:val="1"/>
-        </w:numPr>
-      </w:pPr>
-      <w:r>
-        <w:t xml:space="preserve">Administered local systems infrastructure and trained staff on network security awareness.</w:t>
+        <w:t xml:space="preserve">Deployed and configured Windows desktop environments; executed login scripts and managed client system rollouts.</w:t>
+      </w:r>
+    </w:p>
+    <w:p>
+      <w:pPr>
+        <w:pStyle w:val="Bullet"/>
+        <w:numPr>
+          <w:ilvl w:val="0"/>
+          <w:numId w:val="1"/>
+        </w:numPr>
+      </w:pPr>
+      <w:r>
+        <w:t xml:space="preserve">Administered local systems infrastructure, diagnosed OS and hardware performance issues, and trained staff on network security awareness.</w:t>
       </w:r>
     </w:p>
     <w:p>

</xml_diff>

<commit_message>
Update all Western Pacific CV and cover letter files (MD, JSON, HTML, PDF, DOCX)
</commit_message>
<xml_diff>
--- a/jobs/western-pacific/cv.docx
+++ b/jobs/western-pacific/cv.docx
@@ -31,7 +31,7 @@
         <w:pStyle w:val="Body"/>
       </w:pPr>
       <w:r>
-        <w:t xml:space="preserve">Customer-focused Desktop Support Analyst with 10 years of hands-on IT experience across corporate office and manufacturing/industrial environments. Proven track record managing user accounts and access controls in Active Directory/Okta, deploying system builds with network imaging tools, and resolving walkup, phone, and helpdesk tickets end-to-end. Adept at hardware diagnostics, peripheral and printer fleet management, warehouse device support, and advanced network troubleshooting across Meraki SD-WAN and Ubiquiti UniFi environments, ensuring compliance with IT security and safety protocols.</w:t>
+        <w:t xml:space="preserve">Customer-focused Desktop Support Analyst with 10+ years of hands-on IT experience across corporate, distribution, and manufacturing/industrial environments. Proven track record managing user lifecycles and access controls across Active Directory, Entra ID (Azure AD), and Okta, standardizing system builds with network imaging tools, and resolving walkup, phone, and helpdesk tickets end-to-end. Adept at hardware diagnostics, peripheral and printer fleet management, warehouse device support (barcode/RF scanners, label printers), and network troubleshooting across Meraki SD-WAN environments, minimizing operational IT downtime while ensuring strict security and safety compliance.</w:t>
       </w:r>
     </w:p>
     <w:p>
@@ -55,6 +55,120 @@
           <w:b/>
           <w:bCs/>
         </w:rPr>
+        <w:t xml:space="preserve">Cisco Cybersecurity Essentials</w:t>
+      </w:r>
+      <w:r>
+        <w:t xml:space="preserve"> (2022)</w:t>
+      </w:r>
+    </w:p>
+    <w:p>
+      <w:pPr>
+        <w:pStyle w:val="Bullet"/>
+        <w:numPr>
+          <w:ilvl w:val="0"/>
+          <w:numId w:val="1"/>
+        </w:numPr>
+      </w:pPr>
+      <w:r>
+        <w:rPr>
+          <w:b/>
+          <w:bCs/>
+        </w:rPr>
+        <w:t xml:space="preserve">MTA Microsoft Security Essentials</w:t>
+      </w:r>
+      <w:r>
+        <w:t xml:space="preserve"> (2015)</w:t>
+      </w:r>
+    </w:p>
+    <w:p>
+      <w:pPr>
+        <w:pStyle w:val="Bullet"/>
+        <w:numPr>
+          <w:ilvl w:val="0"/>
+          <w:numId w:val="1"/>
+        </w:numPr>
+      </w:pPr>
+      <w:r>
+        <w:rPr>
+          <w:b/>
+          <w:bCs/>
+        </w:rPr>
+        <w:t xml:space="preserve">MTA Microsoft Server Fundamentals</w:t>
+      </w:r>
+      <w:r>
+        <w:t xml:space="preserve"> (2015)</w:t>
+      </w:r>
+    </w:p>
+    <w:p>
+      <w:pPr>
+        <w:pStyle w:val="Bullet"/>
+        <w:numPr>
+          <w:ilvl w:val="0"/>
+          <w:numId w:val="1"/>
+        </w:numPr>
+      </w:pPr>
+      <w:r>
+        <w:rPr>
+          <w:b/>
+          <w:bCs/>
+        </w:rPr>
+        <w:t xml:space="preserve">MTA Microsoft Networking Fundamentals</w:t>
+      </w:r>
+      <w:r>
+        <w:t xml:space="preserve"> (2015)</w:t>
+      </w:r>
+    </w:p>
+    <w:p>
+      <w:pPr>
+        <w:pStyle w:val="Bullet"/>
+        <w:numPr>
+          <w:ilvl w:val="0"/>
+          <w:numId w:val="1"/>
+        </w:numPr>
+      </w:pPr>
+      <w:r>
+        <w:rPr>
+          <w:b/>
+          <w:bCs/>
+        </w:rPr>
+        <w:t xml:space="preserve">MTA Microsoft Windows OS Fundamentals</w:t>
+      </w:r>
+      <w:r>
+        <w:t xml:space="preserve"> (2015)</w:t>
+      </w:r>
+    </w:p>
+    <w:p>
+      <w:pPr>
+        <w:pStyle w:val="Bullet"/>
+        <w:numPr>
+          <w:ilvl w:val="0"/>
+          <w:numId w:val="1"/>
+        </w:numPr>
+      </w:pPr>
+      <w:r>
+        <w:rPr>
+          <w:b/>
+          <w:bCs/>
+        </w:rPr>
+        <w:t xml:space="preserve">MTA Database Fundamentals</w:t>
+      </w:r>
+      <w:r>
+        <w:t xml:space="preserve"> (2016)</w:t>
+      </w:r>
+    </w:p>
+    <w:p>
+      <w:pPr>
+        <w:pStyle w:val="Bullet"/>
+        <w:numPr>
+          <w:ilvl w:val="0"/>
+          <w:numId w:val="1"/>
+        </w:numPr>
+      </w:pPr>
+      <w:r>
+        <w:rPr>
+          <w:b/>
+          <w:bCs/>
+        </w:rPr>
         <w:t xml:space="preserve">CompTIA A+</w:t>
       </w:r>
       <w:r>
@@ -63,101 +177,6 @@
     </w:p>
     <w:p>
       <w:pPr>
-        <w:pStyle w:val="Bullet"/>
-        <w:numPr>
-          <w:ilvl w:val="0"/>
-          <w:numId w:val="1"/>
-        </w:numPr>
-      </w:pPr>
-      <w:r>
-        <w:rPr>
-          <w:b/>
-          <w:bCs/>
-        </w:rPr>
-        <w:t xml:space="preserve">MTA Microsoft Windows OS Fundamentals</w:t>
-      </w:r>
-      <w:r>
-        <w:t xml:space="preserve"> (2015)</w:t>
-      </w:r>
-    </w:p>
-    <w:p>
-      <w:pPr>
-        <w:pStyle w:val="Bullet"/>
-        <w:numPr>
-          <w:ilvl w:val="0"/>
-          <w:numId w:val="1"/>
-        </w:numPr>
-      </w:pPr>
-      <w:r>
-        <w:rPr>
-          <w:b/>
-          <w:bCs/>
-        </w:rPr>
-        <w:t xml:space="preserve">MTA Microsoft Networking Fundamentals</w:t>
-      </w:r>
-      <w:r>
-        <w:t xml:space="preserve"> (2015)</w:t>
-      </w:r>
-    </w:p>
-    <w:p>
-      <w:pPr>
-        <w:pStyle w:val="Bullet"/>
-        <w:numPr>
-          <w:ilvl w:val="0"/>
-          <w:numId w:val="1"/>
-        </w:numPr>
-      </w:pPr>
-      <w:r>
-        <w:rPr>
-          <w:b/>
-          <w:bCs/>
-        </w:rPr>
-        <w:t xml:space="preserve">MTA Microsoft Server Fundamentals</w:t>
-      </w:r>
-      <w:r>
-        <w:t xml:space="preserve"> (2015)</w:t>
-      </w:r>
-    </w:p>
-    <w:p>
-      <w:pPr>
-        <w:pStyle w:val="Bullet"/>
-        <w:numPr>
-          <w:ilvl w:val="0"/>
-          <w:numId w:val="1"/>
-        </w:numPr>
-      </w:pPr>
-      <w:r>
-        <w:rPr>
-          <w:b/>
-          <w:bCs/>
-        </w:rPr>
-        <w:t xml:space="preserve">MTA Database Fundamentals</w:t>
-      </w:r>
-      <w:r>
-        <w:t xml:space="preserve"> (2016)</w:t>
-      </w:r>
-    </w:p>
-    <w:p>
-      <w:pPr>
-        <w:pStyle w:val="Bullet"/>
-        <w:numPr>
-          <w:ilvl w:val="0"/>
-          <w:numId w:val="1"/>
-        </w:numPr>
-      </w:pPr>
-      <w:r>
-        <w:rPr>
-          <w:b/>
-          <w:bCs/>
-        </w:rPr>
-        <w:t xml:space="preserve">Cisco Cybersecurity Essentials</w:t>
-      </w:r>
-      <w:r>
-        <w:t xml:space="preserve"> (2022)</w:t>
-      </w:r>
-    </w:p>
-    <w:p>
-      <w:pPr>
         <w:pStyle w:val="SectionHeader"/>
       </w:pPr>
       <w:r>
@@ -180,7 +199,45 @@
         <w:t xml:space="preserve">Troubleshooting &amp; Support:</w:t>
       </w:r>
       <w:r>
-        <w:t xml:space="preserve"> Inbound help desk calls, walkup &amp; deskside support, hardware diagnostics, break/fix, printer fleet management (HP/Lexmark, print servers, driver deployment), warehouse devices, A/V conferencing, ServiceNow.</w:t>
+        <w:t xml:space="preserve"> Inbound helpdesk calls, walkup &amp; deskside support, hardware diagnostics, break/fix, printer fleet management (HP/Lexmark, print servers, driver deployment), warehouse peripherals (barcode scanners, thermal label printers, handheld RF units), A/V conferencing, ServiceNow.</w:t>
+      </w:r>
+    </w:p>
+    <w:p>
+      <w:pPr>
+        <w:pStyle w:val="Bullet"/>
+        <w:numPr>
+          <w:ilvl w:val="0"/>
+          <w:numId w:val="1"/>
+        </w:numPr>
+      </w:pPr>
+      <w:r>
+        <w:rPr>
+          <w:b/>
+          <w:bCs/>
+        </w:rPr>
+        <w:t xml:space="preserve">Endpoint &amp; Fleet Management:</w:t>
+      </w:r>
+      <w:r>
+        <w:t xml:space="preserve"> Intune, MobileIron MDM, iOS/macOS setup tools, Ivanti &amp; Acronis system imaging, PowerShell automation.</w:t>
+      </w:r>
+    </w:p>
+    <w:p>
+      <w:pPr>
+        <w:pStyle w:val="Bullet"/>
+        <w:numPr>
+          <w:ilvl w:val="0"/>
+          <w:numId w:val="1"/>
+        </w:numPr>
+      </w:pPr>
+      <w:r>
+        <w:rPr>
+          <w:b/>
+          <w:bCs/>
+        </w:rPr>
+        <w:t xml:space="preserve">Identity &amp; Access Management:</w:t>
+      </w:r>
+      <w:r>
+        <w:t xml:space="preserve"> Active Directory (AD, DNS, DHCP, GPOs), Entra ID (Azure AD), Okta, user lifecycle provisioning &amp; de-provisioning.</w:t>
       </w:r>
     </w:p>
     <w:p>
@@ -199,45 +256,26 @@
         <w:t xml:space="preserve">Operating Systems:</w:t>
       </w:r>
       <w:r>
-        <w:t xml:space="preserve"> Windows 10/11, Windows Server (AD, DNS, DHCP, GPOs), macOS, Linux.</w:t>
-      </w:r>
-    </w:p>
-    <w:p>
-      <w:pPr>
-        <w:pStyle w:val="Bullet"/>
-        <w:numPr>
-          <w:ilvl w:val="0"/>
-          <w:numId w:val="1"/>
-        </w:numPr>
-      </w:pPr>
-      <w:r>
-        <w:rPr>
-          <w:b/>
-          <w:bCs/>
-        </w:rPr>
-        <w:t xml:space="preserve">Networking:</w:t>
-      </w:r>
-      <w:r>
-        <w:t xml:space="preserve"> Cisco/Meraki SD-WAN, Ubiquiti UniFi, VLAN configuration, physical cabling &amp; patching, DNS/DHCP, VPN/IPSec, Wireshark.</w:t>
-      </w:r>
-    </w:p>
-    <w:p>
-      <w:pPr>
-        <w:pStyle w:val="Bullet"/>
-        <w:numPr>
-          <w:ilvl w:val="0"/>
-          <w:numId w:val="1"/>
-        </w:numPr>
-      </w:pPr>
-      <w:r>
-        <w:rPr>
-          <w:b/>
-          <w:bCs/>
-        </w:rPr>
-        <w:t xml:space="preserve">Endpoint &amp; Fleet Management:</w:t>
-      </w:r>
-      <w:r>
-        <w:t xml:space="preserve"> Intune, MobileIron MDM, iOS/macOS setup tools, Ivanti / Acronis imaging, Active Directory / Okta, PowerShell automation.</w:t>
+        <w:t xml:space="preserve"> Windows 10/11, Windows Server, macOS, Linux (RHEL, Ubuntu).</w:t>
+      </w:r>
+    </w:p>
+    <w:p>
+      <w:pPr>
+        <w:pStyle w:val="Bullet"/>
+        <w:numPr>
+          <w:ilvl w:val="0"/>
+          <w:numId w:val="1"/>
+        </w:numPr>
+      </w:pPr>
+      <w:r>
+        <w:rPr>
+          <w:b/>
+          <w:bCs/>
+        </w:rPr>
+        <w:t xml:space="preserve">Networking &amp; Infrastructure:</w:t>
+      </w:r>
+      <w:r>
+        <w:t xml:space="preserve"> Cisco/Meraki SD-WAN, Ubiquiti UniFi, VLAN configuration, physical racking &amp; cabling patching, DNS/DHCP, VPN/IPSec, Wireshark.</w:t>
       </w:r>
     </w:p>
     <w:p>
@@ -256,7 +294,7 @@
         <w:t xml:space="preserve">Continuous Learning &amp; Research:</w:t>
       </w:r>
       <w:r>
-        <w:t xml:space="preserve"> Maintain an enterprise-grade HomeLab (vSphere/ESXi, Active Directory, and virtualized servers) to stay current with emerging technologies and test workflow automation improvements.</w:t>
+        <w:t xml:space="preserve"> Maintain an enterprise-grade HomeLab (vSphere/ESXi, Proxmox VE, Active Directory, virtualized servers) to test workflow automations and stay ahead of emerging tech.</w:t>
       </w:r>
     </w:p>
     <w:p>
@@ -292,55 +330,55 @@
         </w:numPr>
       </w:pPr>
       <w:r>
-        <w:t xml:space="preserve">Handle inbound help desk calls, walkup, and remote support requests via ServiceNow, resolving mobile device, OS, and software issues for corporate end-users.</w:t>
-      </w:r>
-    </w:p>
-    <w:p>
-      <w:pPr>
-        <w:pStyle w:val="Bullet"/>
-        <w:numPr>
-          <w:ilvl w:val="0"/>
-          <w:numId w:val="1"/>
-        </w:numPr>
-      </w:pPr>
-      <w:r>
-        <w:t xml:space="preserve">Order, receive, and provision mobile device fleet inventory (iOS, macOS, and Windows) for end-users, remote workers, and new hires.</w:t>
-      </w:r>
-    </w:p>
-    <w:p>
-      <w:pPr>
-        <w:pStyle w:val="Bullet"/>
-        <w:numPr>
-          <w:ilvl w:val="0"/>
-          <w:numId w:val="1"/>
-        </w:numPr>
-      </w:pPr>
-      <w:r>
-        <w:t xml:space="preserve">Set up and configure client devices using enterprise macOS/iOS setup tools, configuration profiles, and MDM platforms (Intune, MobileIron, Ivanti).</w:t>
-      </w:r>
-    </w:p>
-    <w:p>
-      <w:pPr>
-        <w:pStyle w:val="Bullet"/>
-        <w:numPr>
-          <w:ilvl w:val="0"/>
-          <w:numId w:val="1"/>
-        </w:numPr>
-      </w:pPr>
-      <w:r>
-        <w:t xml:space="preserve">Manage asset lifecycles, execute hardware decommissioning (data wiping, asset de-registration), and resolve escalated ticket queues within strict SLAs.</w:t>
-      </w:r>
-    </w:p>
-    <w:p>
-      <w:pPr>
-        <w:pStyle w:val="Bullet"/>
-        <w:numPr>
-          <w:ilvl w:val="0"/>
-          <w:numId w:val="1"/>
-        </w:numPr>
-      </w:pPr>
-      <w:r>
-        <w:t xml:space="preserve">Develop and maintain IT SOPs and user-facing setup guides adopted as standard procedures for self-service deployments and remote enrollment.</w:t>
+        <w:t xml:space="preserve">Deliver customer-first Tier 1–2 helpdesk, walkup, and remote support via ServiceNow, resolving mobile device, OS, and application issues under strict SLA targets.</w:t>
+      </w:r>
+    </w:p>
+    <w:p>
+      <w:pPr>
+        <w:pStyle w:val="Bullet"/>
+        <w:numPr>
+          <w:ilvl w:val="0"/>
+          <w:numId w:val="1"/>
+        </w:numPr>
+      </w:pPr>
+      <w:r>
+        <w:t xml:space="preserve">Order, receive, provision, and track mobile device fleet inventory (iOS, macOS, Windows) for corporate end-users, remote workers, and new hires.</w:t>
+      </w:r>
+    </w:p>
+    <w:p>
+      <w:pPr>
+        <w:pStyle w:val="Bullet"/>
+        <w:numPr>
+          <w:ilvl w:val="0"/>
+          <w:numId w:val="1"/>
+        </w:numPr>
+      </w:pPr>
+      <w:r>
+        <w:t xml:space="preserve">Configure client endpoints using modern enterprise MDM platforms (Intune, MobileIron, Ivanti), configuration profiles, and automated setup tools.</w:t>
+      </w:r>
+    </w:p>
+    <w:p>
+      <w:pPr>
+        <w:pStyle w:val="Bullet"/>
+        <w:numPr>
+          <w:ilvl w:val="0"/>
+          <w:numId w:val="1"/>
+        </w:numPr>
+      </w:pPr>
+      <w:r>
+        <w:t xml:space="preserve">Oversee asset lifecycle logistics, executing hardware decommissioning, secure data wiping, and asset de-registration.</w:t>
+      </w:r>
+    </w:p>
+    <w:p>
+      <w:pPr>
+        <w:pStyle w:val="Bullet"/>
+        <w:numPr>
+          <w:ilvl w:val="0"/>
+          <w:numId w:val="1"/>
+        </w:numPr>
+      </w:pPr>
+      <w:r>
+        <w:t xml:space="preserve">Author and update standard operating procedures (SOPs) and self-service setup guides, reducing initial onboarding ticket volume.</w:t>
       </w:r>
     </w:p>
     <w:p>
@@ -372,67 +410,67 @@
         </w:numPr>
       </w:pPr>
       <w:r>
-        <w:t xml:space="preserve">Triaged and resolved inbound help desk calls, walk-in requests, and ticket queue end-to-end, independently managing priority and SLA compliance across multiple sites.</w:t>
-      </w:r>
-    </w:p>
-    <w:p>
-      <w:pPr>
-        <w:pStyle w:val="Bullet"/>
-        <w:numPr>
-          <w:ilvl w:val="0"/>
-          <w:numId w:val="1"/>
-        </w:numPr>
-      </w:pPr>
-      <w:r>
-        <w:t xml:space="preserve">Deployed and configured laptops, desktops, and warehouse devices (barcode scanners, label printers, handheld RF units) using Ivanti and Acronis system imaging.</w:t>
-      </w:r>
-    </w:p>
-    <w:p>
-      <w:pPr>
-        <w:pStyle w:val="Bullet"/>
-        <w:numPr>
-          <w:ilvl w:val="0"/>
-          <w:numId w:val="1"/>
-        </w:numPr>
-      </w:pPr>
-      <w:r>
-        <w:t xml:space="preserve">Administered Windows Server environments including Active Directory, DNS, DHCP, and Group Policy Objects (GPOs); automated bulk user provisioning and reporting with PowerShell scripts.</w:t>
-      </w:r>
-    </w:p>
-    <w:p>
-      <w:pPr>
-        <w:pStyle w:val="Bullet"/>
-        <w:numPr>
-          <w:ilvl w:val="0"/>
-          <w:numId w:val="1"/>
-        </w:numPr>
-      </w:pPr>
-      <w:r>
-        <w:t xml:space="preserve">Managed network printer fleet (HP/Lexmark) including print server setup and driver deployment; authored IT SOPs and runbooks in Confluence adopted as branch-wide standard procedures.</w:t>
-      </w:r>
-    </w:p>
-    <w:p>
-      <w:pPr>
-        <w:pStyle w:val="Bullet"/>
-        <w:numPr>
-          <w:ilvl w:val="0"/>
-          <w:numId w:val="1"/>
-        </w:numPr>
-      </w:pPr>
-      <w:r>
-        <w:t xml:space="preserve">Installed and administered Meraki SD-WAN appliances; configured VLANs, racked/patched switching hardware, and terminated network drops; served as Junior Administrator for Cisco and Meraki infrastructure including VoIP systems.</w:t>
-      </w:r>
-    </w:p>
-    <w:p>
-      <w:pPr>
-        <w:pStyle w:val="Bullet"/>
-        <w:numPr>
-          <w:ilvl w:val="0"/>
-          <w:numId w:val="1"/>
-        </w:numPr>
-      </w:pPr>
-      <w:r>
-        <w:t xml:space="preserve">Supported industrial jobsite visits wearing required PPE and adhering to site safety protocols to maintain field office IT hardware.</w:t>
+        <w:t xml:space="preserve">Triaged and resolved walk-in, phone, and ticket queues end-to-end, independently managing priority and SLA compliance across multi-site field and branch operations.</w:t>
+      </w:r>
+    </w:p>
+    <w:p>
+      <w:pPr>
+        <w:pStyle w:val="Bullet"/>
+        <w:numPr>
+          <w:ilvl w:val="0"/>
+          <w:numId w:val="1"/>
+        </w:numPr>
+      </w:pPr>
+      <w:r>
+        <w:t xml:space="preserve">Provisioned and deployed desktops, laptops, and warehouse hardware (barcode scanners, label printers, handheld RF units) via Ivanti and Acronis imaging, standardizing builds and cutting rollout times.</w:t>
+      </w:r>
+    </w:p>
+    <w:p>
+      <w:pPr>
+        <w:pStyle w:val="Bullet"/>
+        <w:numPr>
+          <w:ilvl w:val="0"/>
+          <w:numId w:val="1"/>
+        </w:numPr>
+      </w:pPr>
+      <w:r>
+        <w:t xml:space="preserve">Administered Windows Server environments (Active Directory, DNS, DHCP, GPOs) and Entra ID; automated user provisioning and reporting routines with custom PowerShell scripts.</w:t>
+      </w:r>
+    </w:p>
+    <w:p>
+      <w:pPr>
+        <w:pStyle w:val="Bullet"/>
+        <w:numPr>
+          <w:ilvl w:val="0"/>
+          <w:numId w:val="1"/>
+        </w:numPr>
+      </w:pPr>
+      <w:r>
+        <w:t xml:space="preserve">Managed enterprise network printer fleet (HP/Lexmark), configuring print servers and driver rollouts; authored branch-wide IT SOPs and runbooks in Confluence.</w:t>
+      </w:r>
+    </w:p>
+    <w:p>
+      <w:pPr>
+        <w:pStyle w:val="Bullet"/>
+        <w:numPr>
+          <w:ilvl w:val="0"/>
+          <w:numId w:val="1"/>
+        </w:numPr>
+      </w:pPr>
+      <w:r>
+        <w:t xml:space="preserve">Installed and administered Meraki SD-WAN appliances, configured VLANs, racked/patched switches, and assisted with Cisco networking and VoIP administration.</w:t>
+      </w:r>
+    </w:p>
+    <w:p>
+      <w:pPr>
+        <w:pStyle w:val="Bullet"/>
+        <w:numPr>
+          <w:ilvl w:val="0"/>
+          <w:numId w:val="1"/>
+        </w:numPr>
+      </w:pPr>
+      <w:r>
+        <w:t xml:space="preserve">Conducted industrial site visits adhering to safety/PPE protocols to maintain branch and field office IT hardware and network infrastructure.</w:t>
       </w:r>
     </w:p>
     <w:p>
@@ -464,31 +502,31 @@
         </w:numPr>
       </w:pPr>
       <w:r>
-        <w:t xml:space="preserve">Troubleshot Cisco routing and switching hardware, Microsoft Active Directory forests, and Linux servers.</w:t>
-      </w:r>
-    </w:p>
-    <w:p>
-      <w:pPr>
-        <w:pStyle w:val="Bullet"/>
-        <w:numPr>
-          <w:ilvl w:val="0"/>
-          <w:numId w:val="1"/>
-        </w:numPr>
-      </w:pPr>
-      <w:r>
-        <w:t xml:space="preserve">Performed rack and hardware maintenance including Cisco hardware replacement (HWICs, SMART-Serial), SAN hot-swapping, and UPS battery replacement.</w:t>
-      </w:r>
-    </w:p>
-    <w:p>
-      <w:pPr>
-        <w:pStyle w:val="Bullet"/>
-        <w:numPr>
-          <w:ilvl w:val="0"/>
-          <w:numId w:val="1"/>
-        </w:numPr>
-      </w:pPr>
-      <w:r>
-        <w:t xml:space="preserve">Supported lab infrastructure migrations, mentored students in network subnetting, and gained hands-on AWS EC2 experience through a WebDev course curriculum.</w:t>
+        <w:t xml:space="preserve">Troubleshot Cisco routing/switching hardware, Microsoft Active Directory forests, and Linux servers in an enterprise lab environment.</w:t>
+      </w:r>
+    </w:p>
+    <w:p>
+      <w:pPr>
+        <w:pStyle w:val="Bullet"/>
+        <w:numPr>
+          <w:ilvl w:val="0"/>
+          <w:numId w:val="1"/>
+        </w:numPr>
+      </w:pPr>
+      <w:r>
+        <w:t xml:space="preserve">Executed physical rack maintenance, Cisco module replacements (HWICs, SMART-Serial), SAN hot-swapping, and UPS battery maintenance.</w:t>
+      </w:r>
+    </w:p>
+    <w:p>
+      <w:pPr>
+        <w:pStyle w:val="Bullet"/>
+        <w:numPr>
+          <w:ilvl w:val="0"/>
+          <w:numId w:val="1"/>
+        </w:numPr>
+      </w:pPr>
+      <w:r>
+        <w:t xml:space="preserve">Mentored students in subnetting and network design while gaining hands-on AWS EC2 deployment experience.</w:t>
       </w:r>
     </w:p>
     <w:p>
@@ -516,19 +554,19 @@
         </w:numPr>
       </w:pPr>
       <w:r>
-        <w:t xml:space="preserve">Deployed and configured Windows desktop environments; executed login scripts and managed client system rollouts.</w:t>
-      </w:r>
-    </w:p>
-    <w:p>
-      <w:pPr>
-        <w:pStyle w:val="Bullet"/>
-        <w:numPr>
-          <w:ilvl w:val="0"/>
-          <w:numId w:val="1"/>
-        </w:numPr>
-      </w:pPr>
-      <w:r>
-        <w:t xml:space="preserve">Administered local systems infrastructure, diagnosed OS and hardware performance issues, and trained staff on network security awareness.</w:t>
+        <w:t xml:space="preserve">Deployed and configured Windows desktop environments, executing automated login scripts and client system rollouts.</w:t>
+      </w:r>
+    </w:p>
+    <w:p>
+      <w:pPr>
+        <w:pStyle w:val="Bullet"/>
+        <w:numPr>
+          <w:ilvl w:val="0"/>
+          <w:numId w:val="1"/>
+        </w:numPr>
+      </w:pPr>
+      <w:r>
+        <w:t xml:space="preserve">Administered local infrastructure, diagnosed OS/hardware bottlenecks, and conducted employee cybersecurity security awareness training.</w:t>
       </w:r>
     </w:p>
     <w:p>

</xml_diff>